<commit_message>
Add Flask web app for browser-based document read/write
Lets multiple people open, edit, and save HR/Finance/Development
documents directly in a browser without a check-out step, backed by
the same SQLite database and mirrored files the CLI uses. Gated by a
shared password via HTTP Basic Auth (set with APP_PASSWORD env var).
</commit_message>
<xml_diff>
--- a/documents/HR/employee_handbook.docx
+++ b/documents/HR/employee_handbook.docx
@@ -10,6 +10,11 @@
     <w:p>
       <w:r>
         <w:t>This handbook covers PTO, benefits, and code of conduct.</w:t>
+      </w:r>
+    </w:p>
+    <w:p>
+      <w:r>
+        <w:t>Updated via the web interface.</w:t>
       </w:r>
     </w:p>
     <w:sectPr>

</xml_diff>